<commit_message>
원고: table_description 비교 5.4.1절·표 5-7 신설, 3.2 문장 교체, 답변 표 번호 5-8·5-9로
- 3.2: table_description 을 쓰지 않고 규칙으로 추정한 머리글 경로로 셀 문장을 만들었다, 비교는 5.4.1절
- 5.4.1: 사전등록 b4187a0 1회 실행, 86.34% 대 84.58% (133:82, p=.00062), 그룹 Holm(산술 2+ .00096, 나머지 1.0),
  없는 셀은 본 방법 문장·정답 셀 7,651개 전부 있음, 같은 문장 비율 7.0% 대 0%(원인 검정 안 함),
  머리글 규칙은 평가 집합(train)에서 수정됨
- 근거 파일: gold_dup.{py,json}(정답 셀·같은 문장 재계산), compare.py 그룹 Holm 추가
- 수치 대조: tdesc 원천·앵커·열 지정 추가, 불일치 0·출처 못 찾음 0

Co-Authored-By: Claude Opus 5.5 <noreply@anthropic.com>
</commit_message>
<xml_diff>
--- a/rag-agent/thesis/thesis.docx
+++ b/rag-agent/thesis/thesis.docx
@@ -1791,7 +1791,7 @@
         <w:t xml:space="preserve">&lt;th&gt;</w:t>
       </w:r>
       <w:r>
-        <w:t xml:space="preserve">)가 없는 HTML로 주어지고, 머리글 행·열의 수나 층 구조를 따로 담은 항목은 없다. 데이터셋에는 원 저자의 전처리 스크립트가 데이터 셀마다 계층형 머리글을 이어 붙여 만든 문장(table_description)이 함께 제공된다. 원 논문의 MT2Net도 셀마다 계층형 행·열 머리글을 붙인 문장을 만들고, 이를 학습한 BERT 기반 분류기로 근거 사실을 검색한다(Zhao et al., 2022, 4장). 본 연구는 table_description을 셀 문장 생성에 쓰지 않고, 머리글 행 수와 머리글 열 수를 규칙으로 추정한다. 머리글 행은 (가) 왼쪽 위 모서리가 비어 있는 표에서 처음으로 행 머리글 칸에 글자가 나타나는 행을 첫 데이터 행으로 보고, (나) 이 신호를 쓸 수 없으면 행 머리글 칸을 제외한 칸의 절반 이상이 숫자인 첫 행을 첫 데이터 행으로 본다. 머리글 열은 머리글 블록의 마지막 행에서 비어 있는 왼쪽 열의 수로 정하고, 이 신호를 쓸 수 없으면 데이터처럼 보이는 칸이 절반 이상인 첫 열 앞까지로 정한다. 그다음 머리글 행의 값을 위에서부터 이어 열 경로를, 머리글 열의 값을 왼쪽에서부터 이어 행 경로를 만든다. 이 초기 규칙(v1)은 여러 층으로 된 열 머리글의 일부(예: 위층의 연도)를 데이터 행으로 보아 경로에서 빠뜨리는 경우가 있다. 개발 과정에서 train 분할의 오류 사례를 보고 병합 칸과 절 제목 행을 반영하도록 고친 규칙이 v3.3이다(4.1절). 본 방법의 주 결과는 v3.3에 3.3절의 문장 고유화를 더한 규칙(v3.3u)을 쓰고, v1과 v3.3 결과를 함께 싣는다(5.4절, 5.5절).</w:t>
+        <w:t xml:space="preserve">)가 없는 HTML로 주어지고, 머리글 행·열의 수나 층 구조를 따로 담은 항목은 없다. 데이터셋에는 원 저자의 전처리 스크립트가 데이터 셀마다 계층형 머리글을 이어 붙여 만든 문장(table_description)이 함께 제공된다. 원 논문의 MT2Net도 셀마다 계층형 행·열 머리글을 붙인 문장을 만들고, 이를 학습한 BERT 기반 분류기로 근거 사실을 검색한다(Zhao et al., 2022, 4장). 본 연구는 table_description을 쓰지 않고, 규칙으로 추정한 머리글 경로로 셀 문장을 만들었다. 두 문장의 검색 정확도 비교는 5.4.1절에 싣는다. 머리글 행은 (가) 왼쪽 위 모서리가 비어 있는 표에서 처음으로 행 머리글 칸에 글자가 나타나는 행을 첫 데이터 행으로 보고, (나) 이 신호를 쓸 수 없으면 행 머리글 칸을 제외한 칸의 절반 이상이 숫자인 첫 행을 첫 데이터 행으로 본다. 머리글 열은 머리글 블록의 마지막 행에서 비어 있는 왼쪽 열의 수로 정하고, 이 신호를 쓸 수 없으면 데이터처럼 보이는 칸이 절반 이상인 첫 열 앞까지로 정한다. 그다음 머리글 행의 값을 위에서부터 이어 열 경로를, 머리글 열의 값을 왼쪽에서부터 이어 행 경로를 만든다. 이 초기 규칙(v1)은 여러 층으로 된 열 머리글의 일부(예: 위층의 연도)를 데이터 행으로 보아 경로에서 빠뜨리는 경우가 있다. 개발 과정에서 train 분할의 오류 사례를 보고 병합 칸과 절 제목 행을 반영하도록 고친 규칙이 v3.3이다(4.1절). 본 방법의 주 결과는 v3.3에 3.3절의 문장 고유화를 더한 규칙(v3.3u)을 쓰고, v1과 v3.3 결과를 함께 싣는다(5.4절, 5.5절).</w:t>
       </w:r>
     </w:p>
     <w:p>
@@ -15539,10 +15539,10 @@
     </w:p>
     <w:p>
       <w:pPr>
-        <w:pStyle w:val="Heading2"/>
+        <w:pStyle w:val="Heading3"/>
       </w:pPr>
       <w:r>
-        <w:t xml:space="preserve">5.5 MultiHiertt 답변 정확도</w:t>
+        <w:t xml:space="preserve">5.4.1 데이터셋이 제공한 셀 문장(table_description)과의 비교</w:t>
       </w:r>
     </w:p>
     <w:p>
@@ -15551,7 +15551,1241 @@
         <w:jc w:val="both"/>
       </w:pPr>
       <w:r>
-        <w:t xml:space="preserve">표 5-7은 네 그룹 882건에서 검색 결과를 그대로 리더(Qwen3-8B 4비트, 풀이 허용, 384토큰)에 넣었을 때의 답변 정확도다. 본 방법과 고정 청크는 둘 다 최종 머리글 규칙의 검색 결과를 쓴다. 표 전체와 TableRAG(Yu) 청크의 리더 입력은 머리글 규칙과 무관하다(4.2절). 가중 전체는 그룹별 정확도를 모집단 비율로 가중한 값이다(4.3절).</w:t>
+        <w:t xml:space="preserve">MultiHiertt가 함께 제공하는 셀 문장(table_description, 3.2절)으로 셀 문장만 바꾸어 검색 정확도를 비교했다. 인코더, 하이브리드 검색(α=0.7), 예산 20셀, 문서 안 검색, 채점 2,885건은 본 방법과 같다. 이 비교는 사전등록(커밋 b4187a0) 후 1회 실행했다. 색인 셀 중 table_description이 없는 셀에는 본 방법 문장을 그대로 썼고, 채점 2,885건의 정답 셀 7,651개는 모두 table_description이 있다. 머리글 규칙은 평가 집합(train)에서 수정되었다(4.1절).</w:t>
+      </w:r>
+    </w:p>
+    <w:p>
+      <w:pPr>
+        <w:pStyle w:val="TableCaption"/>
+      </w:pPr>
+      <w:r>
+        <w:t xml:space="preserve">[표 5-7] 본 방법과 table_description 셀 문장의 검색 정확도 (MultiHiertt, 문서 안, 예산 20, query count=2,885)</w:t>
+      </w:r>
+    </w:p>
+    <w:tbl>
+      <w:tblPr>
+        <w:tblW w:type="dxa" w:w="7370"/>
+        <w:tblBorders>
+          <w:top w:val="single" w:color="auto" w:sz="4"/>
+          <w:left w:val="single" w:color="auto" w:sz="4"/>
+          <w:bottom w:val="single" w:color="auto" w:sz="4"/>
+          <w:right w:val="single" w:color="auto" w:sz="4"/>
+          <w:insideH w:val="single" w:color="auto" w:sz="4"/>
+          <w:insideV w:val="single" w:color="auto" w:sz="4"/>
+        </w:tblBorders>
+        <w:tblLayout w:type="fixed"/>
+      </w:tblPr>
+      <w:tblGrid>
+        <w:gridCol w:w="968"/>
+        <w:gridCol w:w="825"/>
+        <w:gridCol w:w="726"/>
+        <w:gridCol w:w="1864"/>
+        <w:gridCol w:w="2142"/>
+        <w:gridCol w:w="845"/>
+      </w:tblGrid>
+      <w:tr>
+        <w:trPr>
+          <w:tblHeader/>
+        </w:trPr>
+        <w:tc>
+          <w:tcPr>
+            <w:tcW w:type="dxa" w:w="968"/>
+            <w:tcBorders>
+              <w:top w:val="single" w:color="808080" w:sz="4"/>
+              <w:left w:val="single" w:color="808080" w:sz="4"/>
+              <w:bottom w:val="single" w:color="808080" w:sz="4"/>
+              <w:right w:val="single" w:color="808080" w:sz="4"/>
+            </w:tcBorders>
+            <w:shd w:fill="E7E6E6" w:color="auto" w:val="clear"/>
+            <w:tcMar>
+              <w:top w:type="dxa" w:w="40"/>
+              <w:left w:type="dxa" w:w="80"/>
+              <w:bottom w:type="dxa" w:w="40"/>
+              <w:right w:type="dxa" w:w="80"/>
+            </w:tcMar>
+            <w:vAlign w:val="center"/>
+          </w:tcPr>
+          <w:p>
+            <w:pPr>
+              <w:spacing w:after="0" w:before="0" w:line="260"/>
+              <w:jc w:val="center"/>
+            </w:pPr>
+            <w:r>
+              <w:rPr>
+                <w:b/>
+                <w:bCs/>
+                <w:sz w:val="17"/>
+                <w:szCs w:val="17"/>
+              </w:rPr>
+              <w:t xml:space="preserve">그룹</w:t>
+            </w:r>
+          </w:p>
+        </w:tc>
+        <w:tc>
+          <w:tcPr>
+            <w:tcW w:type="dxa" w:w="825"/>
+            <w:tcBorders>
+              <w:top w:val="single" w:color="808080" w:sz="4"/>
+              <w:left w:val="single" w:color="808080" w:sz="4"/>
+              <w:bottom w:val="single" w:color="808080" w:sz="4"/>
+              <w:right w:val="single" w:color="808080" w:sz="4"/>
+            </w:tcBorders>
+            <w:shd w:fill="E7E6E6" w:color="auto" w:val="clear"/>
+            <w:tcMar>
+              <w:top w:type="dxa" w:w="40"/>
+              <w:left w:type="dxa" w:w="80"/>
+              <w:bottom w:type="dxa" w:w="40"/>
+              <w:right w:type="dxa" w:w="80"/>
+            </w:tcMar>
+            <w:vAlign w:val="center"/>
+          </w:tcPr>
+          <w:p>
+            <w:pPr>
+              <w:spacing w:after="0" w:before="0" w:line="260"/>
+              <w:jc w:val="center"/>
+            </w:pPr>
+            <w:r>
+              <w:rPr>
+                <w:b/>
+                <w:bCs/>
+                <w:sz w:val="17"/>
+                <w:szCs w:val="17"/>
+              </w:rPr>
+              <w:t xml:space="preserve">query count</w:t>
+            </w:r>
+          </w:p>
+        </w:tc>
+        <w:tc>
+          <w:tcPr>
+            <w:tcW w:type="dxa" w:w="726"/>
+            <w:tcBorders>
+              <w:top w:val="single" w:color="808080" w:sz="4"/>
+              <w:left w:val="single" w:color="808080" w:sz="4"/>
+              <w:bottom w:val="single" w:color="808080" w:sz="4"/>
+              <w:right w:val="single" w:color="808080" w:sz="4"/>
+            </w:tcBorders>
+            <w:shd w:fill="E7E6E6" w:color="auto" w:val="clear"/>
+            <w:tcMar>
+              <w:top w:type="dxa" w:w="40"/>
+              <w:left w:type="dxa" w:w="80"/>
+              <w:bottom w:type="dxa" w:w="40"/>
+              <w:right w:type="dxa" w:w="80"/>
+            </w:tcMar>
+            <w:vAlign w:val="center"/>
+          </w:tcPr>
+          <w:p>
+            <w:pPr>
+              <w:spacing w:after="0" w:before="0" w:line="260"/>
+              <w:jc w:val="center"/>
+            </w:pPr>
+            <w:r>
+              <w:rPr>
+                <w:b/>
+                <w:bCs/>
+                <w:sz w:val="17"/>
+                <w:szCs w:val="17"/>
+              </w:rPr>
+              <w:t xml:space="preserve">본 방법</w:t>
+            </w:r>
+          </w:p>
+        </w:tc>
+        <w:tc>
+          <w:tcPr>
+            <w:tcW w:type="dxa" w:w="1864"/>
+            <w:tcBorders>
+              <w:top w:val="single" w:color="808080" w:sz="4"/>
+              <w:left w:val="single" w:color="808080" w:sz="4"/>
+              <w:bottom w:val="single" w:color="808080" w:sz="4"/>
+              <w:right w:val="single" w:color="808080" w:sz="4"/>
+            </w:tcBorders>
+            <w:shd w:fill="E7E6E6" w:color="auto" w:val="clear"/>
+            <w:tcMar>
+              <w:top w:type="dxa" w:w="40"/>
+              <w:left w:type="dxa" w:w="80"/>
+              <w:bottom w:type="dxa" w:w="40"/>
+              <w:right w:type="dxa" w:w="80"/>
+            </w:tcMar>
+            <w:vAlign w:val="center"/>
+          </w:tcPr>
+          <w:p>
+            <w:pPr>
+              <w:spacing w:after="0" w:before="0" w:line="260"/>
+              <w:jc w:val="center"/>
+            </w:pPr>
+            <w:r>
+              <w:rPr>
+                <w:b/>
+                <w:bCs/>
+                <w:sz w:val="17"/>
+                <w:szCs w:val="17"/>
+              </w:rPr>
+              <w:t xml:space="preserve">table_description</w:t>
+            </w:r>
+          </w:p>
+        </w:tc>
+        <w:tc>
+          <w:tcPr>
+            <w:tcW w:type="dxa" w:w="2142"/>
+            <w:tcBorders>
+              <w:top w:val="single" w:color="808080" w:sz="4"/>
+              <w:left w:val="single" w:color="808080" w:sz="4"/>
+              <w:bottom w:val="single" w:color="808080" w:sz="4"/>
+              <w:right w:val="single" w:color="808080" w:sz="4"/>
+            </w:tcBorders>
+            <w:shd w:fill="E7E6E6" w:color="auto" w:val="clear"/>
+            <w:tcMar>
+              <w:top w:type="dxa" w:w="40"/>
+              <w:left w:type="dxa" w:w="80"/>
+              <w:bottom w:type="dxa" w:w="40"/>
+              <w:right w:type="dxa" w:w="80"/>
+            </w:tcMar>
+            <w:vAlign w:val="center"/>
+          </w:tcPr>
+          <w:p>
+            <w:pPr>
+              <w:spacing w:after="0" w:before="0" w:line="260"/>
+              <w:jc w:val="center"/>
+            </w:pPr>
+            <w:r>
+              <w:rPr>
+                <w:b/>
+                <w:bCs/>
+                <w:sz w:val="17"/>
+                <w:szCs w:val="17"/>
+              </w:rPr>
+              <w:t xml:space="preserve">본 방법만 : table_description만</w:t>
+            </w:r>
+          </w:p>
+        </w:tc>
+        <w:tc>
+          <w:tcPr>
+            <w:tcW w:type="dxa" w:w="845"/>
+            <w:tcBorders>
+              <w:top w:val="single" w:color="808080" w:sz="4"/>
+              <w:left w:val="single" w:color="808080" w:sz="4"/>
+              <w:bottom w:val="single" w:color="808080" w:sz="4"/>
+              <w:right w:val="single" w:color="808080" w:sz="4"/>
+            </w:tcBorders>
+            <w:shd w:fill="E7E6E6" w:color="auto" w:val="clear"/>
+            <w:tcMar>
+              <w:top w:type="dxa" w:w="40"/>
+              <w:left w:type="dxa" w:w="80"/>
+              <w:bottom w:type="dxa" w:w="40"/>
+              <w:right w:type="dxa" w:w="80"/>
+            </w:tcMar>
+            <w:vAlign w:val="center"/>
+          </w:tcPr>
+          <w:p>
+            <w:pPr>
+              <w:spacing w:after="0" w:before="0" w:line="260"/>
+              <w:jc w:val="center"/>
+            </w:pPr>
+            <w:r>
+              <w:rPr>
+                <w:b/>
+                <w:bCs/>
+                <w:sz w:val="17"/>
+                <w:szCs w:val="17"/>
+              </w:rPr>
+              <w:t xml:space="preserve">Holm p</w:t>
+            </w:r>
+          </w:p>
+        </w:tc>
+      </w:tr>
+      <w:tr>
+        <w:trPr>
+          <w:tblHeader w:val="false"/>
+        </w:trPr>
+        <w:tc>
+          <w:tcPr>
+            <w:tcW w:type="dxa" w:w="968"/>
+            <w:tcBorders>
+              <w:top w:val="single" w:color="808080" w:sz="4"/>
+              <w:left w:val="single" w:color="808080" w:sz="4"/>
+              <w:bottom w:val="single" w:color="808080" w:sz="4"/>
+              <w:right w:val="single" w:color="808080" w:sz="4"/>
+            </w:tcBorders>
+            <w:tcMar>
+              <w:top w:type="dxa" w:w="40"/>
+              <w:left w:type="dxa" w:w="80"/>
+              <w:bottom w:type="dxa" w:w="40"/>
+              <w:right w:type="dxa" w:w="80"/>
+            </w:tcMar>
+            <w:vAlign w:val="center"/>
+          </w:tcPr>
+          <w:p>
+            <w:pPr>
+              <w:spacing w:after="0" w:before="0" w:line="260"/>
+              <w:jc w:val="left"/>
+            </w:pPr>
+            <w:r>
+              <w:rPr>
+                <w:sz w:val="17"/>
+                <w:szCs w:val="17"/>
+              </w:rPr>
+              <w:t xml:space="preserve">조회·셀 1개</w:t>
+            </w:r>
+          </w:p>
+        </w:tc>
+        <w:tc>
+          <w:tcPr>
+            <w:tcW w:type="dxa" w:w="825"/>
+            <w:tcBorders>
+              <w:top w:val="single" w:color="808080" w:sz="4"/>
+              <w:left w:val="single" w:color="808080" w:sz="4"/>
+              <w:bottom w:val="single" w:color="808080" w:sz="4"/>
+              <w:right w:val="single" w:color="808080" w:sz="4"/>
+            </w:tcBorders>
+            <w:tcMar>
+              <w:top w:type="dxa" w:w="40"/>
+              <w:left w:type="dxa" w:w="80"/>
+              <w:bottom w:type="dxa" w:w="40"/>
+              <w:right w:type="dxa" w:w="80"/>
+            </w:tcMar>
+            <w:vAlign w:val="center"/>
+          </w:tcPr>
+          <w:p>
+            <w:pPr>
+              <w:spacing w:after="0" w:before="0" w:line="260"/>
+              <w:jc w:val="right"/>
+            </w:pPr>
+            <w:r>
+              <w:rPr>
+                <w:sz w:val="17"/>
+                <w:szCs w:val="17"/>
+              </w:rPr>
+              <w:t xml:space="preserve">212</w:t>
+            </w:r>
+          </w:p>
+        </w:tc>
+        <w:tc>
+          <w:tcPr>
+            <w:tcW w:type="dxa" w:w="726"/>
+            <w:tcBorders>
+              <w:top w:val="single" w:color="808080" w:sz="4"/>
+              <w:left w:val="single" w:color="808080" w:sz="4"/>
+              <w:bottom w:val="single" w:color="808080" w:sz="4"/>
+              <w:right w:val="single" w:color="808080" w:sz="4"/>
+            </w:tcBorders>
+            <w:tcMar>
+              <w:top w:type="dxa" w:w="40"/>
+              <w:left w:type="dxa" w:w="80"/>
+              <w:bottom w:type="dxa" w:w="40"/>
+              <w:right w:type="dxa" w:w="80"/>
+            </w:tcMar>
+            <w:vAlign w:val="center"/>
+          </w:tcPr>
+          <w:p>
+            <w:pPr>
+              <w:spacing w:after="0" w:before="0" w:line="260"/>
+              <w:jc w:val="right"/>
+            </w:pPr>
+            <w:r>
+              <w:rPr>
+                <w:sz w:val="17"/>
+                <w:szCs w:val="17"/>
+              </w:rPr>
+              <w:t xml:space="preserve">.9575</w:t>
+            </w:r>
+          </w:p>
+        </w:tc>
+        <w:tc>
+          <w:tcPr>
+            <w:tcW w:type="dxa" w:w="1864"/>
+            <w:tcBorders>
+              <w:top w:val="single" w:color="808080" w:sz="4"/>
+              <w:left w:val="single" w:color="808080" w:sz="4"/>
+              <w:bottom w:val="single" w:color="808080" w:sz="4"/>
+              <w:right w:val="single" w:color="808080" w:sz="4"/>
+            </w:tcBorders>
+            <w:tcMar>
+              <w:top w:type="dxa" w:w="40"/>
+              <w:left w:type="dxa" w:w="80"/>
+              <w:bottom w:type="dxa" w:w="40"/>
+              <w:right w:type="dxa" w:w="80"/>
+            </w:tcMar>
+            <w:vAlign w:val="center"/>
+          </w:tcPr>
+          <w:p>
+            <w:pPr>
+              <w:spacing w:after="0" w:before="0" w:line="260"/>
+              <w:jc w:val="right"/>
+            </w:pPr>
+            <w:r>
+              <w:rPr>
+                <w:sz w:val="17"/>
+                <w:szCs w:val="17"/>
+              </w:rPr>
+              <w:t xml:space="preserve">.9528</w:t>
+            </w:r>
+          </w:p>
+        </w:tc>
+        <w:tc>
+          <w:tcPr>
+            <w:tcW w:type="dxa" w:w="2142"/>
+            <w:tcBorders>
+              <w:top w:val="single" w:color="808080" w:sz="4"/>
+              <w:left w:val="single" w:color="808080" w:sz="4"/>
+              <w:bottom w:val="single" w:color="808080" w:sz="4"/>
+              <w:right w:val="single" w:color="808080" w:sz="4"/>
+            </w:tcBorders>
+            <w:tcMar>
+              <w:top w:type="dxa" w:w="40"/>
+              <w:left w:type="dxa" w:w="80"/>
+              <w:bottom w:type="dxa" w:w="40"/>
+              <w:right w:type="dxa" w:w="80"/>
+            </w:tcMar>
+            <w:vAlign w:val="center"/>
+          </w:tcPr>
+          <w:p>
+            <w:pPr>
+              <w:spacing w:after="0" w:before="0" w:line="260"/>
+              <w:jc w:val="right"/>
+            </w:pPr>
+            <w:r>
+              <w:rPr>
+                <w:sz w:val="17"/>
+                <w:szCs w:val="17"/>
+              </w:rPr>
+              <w:t xml:space="preserve">5:4</w:t>
+            </w:r>
+          </w:p>
+        </w:tc>
+        <w:tc>
+          <w:tcPr>
+            <w:tcW w:type="dxa" w:w="845"/>
+            <w:tcBorders>
+              <w:top w:val="single" w:color="808080" w:sz="4"/>
+              <w:left w:val="single" w:color="808080" w:sz="4"/>
+              <w:bottom w:val="single" w:color="808080" w:sz="4"/>
+              <w:right w:val="single" w:color="808080" w:sz="4"/>
+            </w:tcBorders>
+            <w:tcMar>
+              <w:top w:type="dxa" w:w="40"/>
+              <w:left w:type="dxa" w:w="80"/>
+              <w:bottom w:type="dxa" w:w="40"/>
+              <w:right w:type="dxa" w:w="80"/>
+            </w:tcMar>
+            <w:vAlign w:val="center"/>
+          </w:tcPr>
+          <w:p>
+            <w:pPr>
+              <w:spacing w:after="0" w:before="0" w:line="260"/>
+              <w:jc w:val="right"/>
+            </w:pPr>
+            <w:r>
+              <w:rPr>
+                <w:sz w:val="17"/>
+                <w:szCs w:val="17"/>
+              </w:rPr>
+              <w:t xml:space="preserve">1.0</w:t>
+            </w:r>
+          </w:p>
+        </w:tc>
+      </w:tr>
+      <w:tr>
+        <w:trPr>
+          <w:tblHeader w:val="false"/>
+        </w:trPr>
+        <w:tc>
+          <w:tcPr>
+            <w:tcW w:type="dxa" w:w="968"/>
+            <w:tcBorders>
+              <w:top w:val="single" w:color="808080" w:sz="4"/>
+              <w:left w:val="single" w:color="808080" w:sz="4"/>
+              <w:bottom w:val="single" w:color="808080" w:sz="4"/>
+              <w:right w:val="single" w:color="808080" w:sz="4"/>
+            </w:tcBorders>
+            <w:tcMar>
+              <w:top w:type="dxa" w:w="40"/>
+              <w:left w:type="dxa" w:w="80"/>
+              <w:bottom w:type="dxa" w:w="40"/>
+              <w:right w:type="dxa" w:w="80"/>
+            </w:tcMar>
+            <w:vAlign w:val="center"/>
+          </w:tcPr>
+          <w:p>
+            <w:pPr>
+              <w:spacing w:after="0" w:before="0" w:line="260"/>
+              <w:jc w:val="left"/>
+            </w:pPr>
+            <w:r>
+              <w:rPr>
+                <w:sz w:val="17"/>
+                <w:szCs w:val="17"/>
+              </w:rPr>
+              <w:t xml:space="preserve">조회·셀 2개+</w:t>
+            </w:r>
+          </w:p>
+        </w:tc>
+        <w:tc>
+          <w:tcPr>
+            <w:tcW w:type="dxa" w:w="825"/>
+            <w:tcBorders>
+              <w:top w:val="single" w:color="808080" w:sz="4"/>
+              <w:left w:val="single" w:color="808080" w:sz="4"/>
+              <w:bottom w:val="single" w:color="808080" w:sz="4"/>
+              <w:right w:val="single" w:color="808080" w:sz="4"/>
+            </w:tcBorders>
+            <w:tcMar>
+              <w:top w:type="dxa" w:w="40"/>
+              <w:left w:type="dxa" w:w="80"/>
+              <w:bottom w:type="dxa" w:w="40"/>
+              <w:right w:type="dxa" w:w="80"/>
+            </w:tcMar>
+            <w:vAlign w:val="center"/>
+          </w:tcPr>
+          <w:p>
+            <w:pPr>
+              <w:spacing w:after="0" w:before="0" w:line="260"/>
+              <w:jc w:val="right"/>
+            </w:pPr>
+            <w:r>
+              <w:rPr>
+                <w:sz w:val="17"/>
+                <w:szCs w:val="17"/>
+              </w:rPr>
+              <w:t xml:space="preserve">367</w:t>
+            </w:r>
+          </w:p>
+        </w:tc>
+        <w:tc>
+          <w:tcPr>
+            <w:tcW w:type="dxa" w:w="726"/>
+            <w:tcBorders>
+              <w:top w:val="single" w:color="808080" w:sz="4"/>
+              <w:left w:val="single" w:color="808080" w:sz="4"/>
+              <w:bottom w:val="single" w:color="808080" w:sz="4"/>
+              <w:right w:val="single" w:color="808080" w:sz="4"/>
+            </w:tcBorders>
+            <w:tcMar>
+              <w:top w:type="dxa" w:w="40"/>
+              <w:left w:type="dxa" w:w="80"/>
+              <w:bottom w:type="dxa" w:w="40"/>
+              <w:right w:type="dxa" w:w="80"/>
+            </w:tcMar>
+            <w:vAlign w:val="center"/>
+          </w:tcPr>
+          <w:p>
+            <w:pPr>
+              <w:spacing w:after="0" w:before="0" w:line="260"/>
+              <w:jc w:val="right"/>
+            </w:pPr>
+            <w:r>
+              <w:rPr>
+                <w:sz w:val="17"/>
+                <w:szCs w:val="17"/>
+              </w:rPr>
+              <w:t xml:space="preserve">.8774</w:t>
+            </w:r>
+          </w:p>
+        </w:tc>
+        <w:tc>
+          <w:tcPr>
+            <w:tcW w:type="dxa" w:w="1864"/>
+            <w:tcBorders>
+              <w:top w:val="single" w:color="808080" w:sz="4"/>
+              <w:left w:val="single" w:color="808080" w:sz="4"/>
+              <w:bottom w:val="single" w:color="808080" w:sz="4"/>
+              <w:right w:val="single" w:color="808080" w:sz="4"/>
+            </w:tcBorders>
+            <w:tcMar>
+              <w:top w:type="dxa" w:w="40"/>
+              <w:left w:type="dxa" w:w="80"/>
+              <w:bottom w:type="dxa" w:w="40"/>
+              <w:right w:type="dxa" w:w="80"/>
+            </w:tcMar>
+            <w:vAlign w:val="center"/>
+          </w:tcPr>
+          <w:p>
+            <w:pPr>
+              <w:spacing w:after="0" w:before="0" w:line="260"/>
+              <w:jc w:val="right"/>
+            </w:pPr>
+            <w:r>
+              <w:rPr>
+                <w:sz w:val="17"/>
+                <w:szCs w:val="17"/>
+              </w:rPr>
+              <w:t xml:space="preserve">.8747</w:t>
+            </w:r>
+          </w:p>
+        </w:tc>
+        <w:tc>
+          <w:tcPr>
+            <w:tcW w:type="dxa" w:w="2142"/>
+            <w:tcBorders>
+              <w:top w:val="single" w:color="808080" w:sz="4"/>
+              <w:left w:val="single" w:color="808080" w:sz="4"/>
+              <w:bottom w:val="single" w:color="808080" w:sz="4"/>
+              <w:right w:val="single" w:color="808080" w:sz="4"/>
+            </w:tcBorders>
+            <w:tcMar>
+              <w:top w:type="dxa" w:w="40"/>
+              <w:left w:type="dxa" w:w="80"/>
+              <w:bottom w:type="dxa" w:w="40"/>
+              <w:right w:type="dxa" w:w="80"/>
+            </w:tcMar>
+            <w:vAlign w:val="center"/>
+          </w:tcPr>
+          <w:p>
+            <w:pPr>
+              <w:spacing w:after="0" w:before="0" w:line="260"/>
+              <w:jc w:val="right"/>
+            </w:pPr>
+            <w:r>
+              <w:rPr>
+                <w:sz w:val="17"/>
+                <w:szCs w:val="17"/>
+              </w:rPr>
+              <w:t xml:space="preserve">16:15</w:t>
+            </w:r>
+          </w:p>
+        </w:tc>
+        <w:tc>
+          <w:tcPr>
+            <w:tcW w:type="dxa" w:w="845"/>
+            <w:tcBorders>
+              <w:top w:val="single" w:color="808080" w:sz="4"/>
+              <w:left w:val="single" w:color="808080" w:sz="4"/>
+              <w:bottom w:val="single" w:color="808080" w:sz="4"/>
+              <w:right w:val="single" w:color="808080" w:sz="4"/>
+            </w:tcBorders>
+            <w:tcMar>
+              <w:top w:type="dxa" w:w="40"/>
+              <w:left w:type="dxa" w:w="80"/>
+              <w:bottom w:type="dxa" w:w="40"/>
+              <w:right w:type="dxa" w:w="80"/>
+            </w:tcMar>
+            <w:vAlign w:val="center"/>
+          </w:tcPr>
+          <w:p>
+            <w:pPr>
+              <w:spacing w:after="0" w:before="0" w:line="260"/>
+              <w:jc w:val="right"/>
+            </w:pPr>
+            <w:r>
+              <w:rPr>
+                <w:sz w:val="17"/>
+                <w:szCs w:val="17"/>
+              </w:rPr>
+              <w:t xml:space="preserve">1.0</w:t>
+            </w:r>
+          </w:p>
+        </w:tc>
+      </w:tr>
+      <w:tr>
+        <w:trPr>
+          <w:tblHeader w:val="false"/>
+        </w:trPr>
+        <w:tc>
+          <w:tcPr>
+            <w:tcW w:type="dxa" w:w="968"/>
+            <w:tcBorders>
+              <w:top w:val="single" w:color="808080" w:sz="4"/>
+              <w:left w:val="single" w:color="808080" w:sz="4"/>
+              <w:bottom w:val="single" w:color="808080" w:sz="4"/>
+              <w:right w:val="single" w:color="808080" w:sz="4"/>
+            </w:tcBorders>
+            <w:tcMar>
+              <w:top w:type="dxa" w:w="40"/>
+              <w:left w:type="dxa" w:w="80"/>
+              <w:bottom w:type="dxa" w:w="40"/>
+              <w:right w:type="dxa" w:w="80"/>
+            </w:tcMar>
+            <w:vAlign w:val="center"/>
+          </w:tcPr>
+          <w:p>
+            <w:pPr>
+              <w:spacing w:after="0" w:before="0" w:line="260"/>
+              <w:jc w:val="left"/>
+            </w:pPr>
+            <w:r>
+              <w:rPr>
+                <w:sz w:val="17"/>
+                <w:szCs w:val="17"/>
+              </w:rPr>
+              <w:t xml:space="preserve">산술·셀 1개</w:t>
+            </w:r>
+          </w:p>
+        </w:tc>
+        <w:tc>
+          <w:tcPr>
+            <w:tcW w:type="dxa" w:w="825"/>
+            <w:tcBorders>
+              <w:top w:val="single" w:color="808080" w:sz="4"/>
+              <w:left w:val="single" w:color="808080" w:sz="4"/>
+              <w:bottom w:val="single" w:color="808080" w:sz="4"/>
+              <w:right w:val="single" w:color="808080" w:sz="4"/>
+            </w:tcBorders>
+            <w:tcMar>
+              <w:top w:type="dxa" w:w="40"/>
+              <w:left w:type="dxa" w:w="80"/>
+              <w:bottom w:type="dxa" w:w="40"/>
+              <w:right w:type="dxa" w:w="80"/>
+            </w:tcMar>
+            <w:vAlign w:val="center"/>
+          </w:tcPr>
+          <w:p>
+            <w:pPr>
+              <w:spacing w:after="0" w:before="0" w:line="260"/>
+              <w:jc w:val="right"/>
+            </w:pPr>
+            <w:r>
+              <w:rPr>
+                <w:sz w:val="17"/>
+                <w:szCs w:val="17"/>
+              </w:rPr>
+              <w:t xml:space="preserve">71</w:t>
+            </w:r>
+          </w:p>
+        </w:tc>
+        <w:tc>
+          <w:tcPr>
+            <w:tcW w:type="dxa" w:w="726"/>
+            <w:tcBorders>
+              <w:top w:val="single" w:color="808080" w:sz="4"/>
+              <w:left w:val="single" w:color="808080" w:sz="4"/>
+              <w:bottom w:val="single" w:color="808080" w:sz="4"/>
+              <w:right w:val="single" w:color="808080" w:sz="4"/>
+            </w:tcBorders>
+            <w:tcMar>
+              <w:top w:type="dxa" w:w="40"/>
+              <w:left w:type="dxa" w:w="80"/>
+              <w:bottom w:type="dxa" w:w="40"/>
+              <w:right w:type="dxa" w:w="80"/>
+            </w:tcMar>
+            <w:vAlign w:val="center"/>
+          </w:tcPr>
+          <w:p>
+            <w:pPr>
+              <w:spacing w:after="0" w:before="0" w:line="260"/>
+              <w:jc w:val="right"/>
+            </w:pPr>
+            <w:r>
+              <w:rPr>
+                <w:sz w:val="17"/>
+                <w:szCs w:val="17"/>
+              </w:rPr>
+              <w:t xml:space="preserve">.9577</w:t>
+            </w:r>
+          </w:p>
+        </w:tc>
+        <w:tc>
+          <w:tcPr>
+            <w:tcW w:type="dxa" w:w="1864"/>
+            <w:tcBorders>
+              <w:top w:val="single" w:color="808080" w:sz="4"/>
+              <w:left w:val="single" w:color="808080" w:sz="4"/>
+              <w:bottom w:val="single" w:color="808080" w:sz="4"/>
+              <w:right w:val="single" w:color="808080" w:sz="4"/>
+            </w:tcBorders>
+            <w:tcMar>
+              <w:top w:type="dxa" w:w="40"/>
+              <w:left w:type="dxa" w:w="80"/>
+              <w:bottom w:type="dxa" w:w="40"/>
+              <w:right w:type="dxa" w:w="80"/>
+            </w:tcMar>
+            <w:vAlign w:val="center"/>
+          </w:tcPr>
+          <w:p>
+            <w:pPr>
+              <w:spacing w:after="0" w:before="0" w:line="260"/>
+              <w:jc w:val="right"/>
+            </w:pPr>
+            <w:r>
+              <w:rPr>
+                <w:sz w:val="17"/>
+                <w:szCs w:val="17"/>
+              </w:rPr>
+              <w:t xml:space="preserve">.9577</w:t>
+            </w:r>
+          </w:p>
+        </w:tc>
+        <w:tc>
+          <w:tcPr>
+            <w:tcW w:type="dxa" w:w="2142"/>
+            <w:tcBorders>
+              <w:top w:val="single" w:color="808080" w:sz="4"/>
+              <w:left w:val="single" w:color="808080" w:sz="4"/>
+              <w:bottom w:val="single" w:color="808080" w:sz="4"/>
+              <w:right w:val="single" w:color="808080" w:sz="4"/>
+            </w:tcBorders>
+            <w:tcMar>
+              <w:top w:type="dxa" w:w="40"/>
+              <w:left w:type="dxa" w:w="80"/>
+              <w:bottom w:type="dxa" w:w="40"/>
+              <w:right w:type="dxa" w:w="80"/>
+            </w:tcMar>
+            <w:vAlign w:val="center"/>
+          </w:tcPr>
+          <w:p>
+            <w:pPr>
+              <w:spacing w:after="0" w:before="0" w:line="260"/>
+              <w:jc w:val="right"/>
+            </w:pPr>
+            <w:r>
+              <w:rPr>
+                <w:sz w:val="17"/>
+                <w:szCs w:val="17"/>
+              </w:rPr>
+              <w:t xml:space="preserve">1:1</w:t>
+            </w:r>
+          </w:p>
+        </w:tc>
+        <w:tc>
+          <w:tcPr>
+            <w:tcW w:type="dxa" w:w="845"/>
+            <w:tcBorders>
+              <w:top w:val="single" w:color="808080" w:sz="4"/>
+              <w:left w:val="single" w:color="808080" w:sz="4"/>
+              <w:bottom w:val="single" w:color="808080" w:sz="4"/>
+              <w:right w:val="single" w:color="808080" w:sz="4"/>
+            </w:tcBorders>
+            <w:tcMar>
+              <w:top w:type="dxa" w:w="40"/>
+              <w:left w:type="dxa" w:w="80"/>
+              <w:bottom w:type="dxa" w:w="40"/>
+              <w:right w:type="dxa" w:w="80"/>
+            </w:tcMar>
+            <w:vAlign w:val="center"/>
+          </w:tcPr>
+          <w:p>
+            <w:pPr>
+              <w:spacing w:after="0" w:before="0" w:line="260"/>
+              <w:jc w:val="right"/>
+            </w:pPr>
+            <w:r>
+              <w:rPr>
+                <w:sz w:val="17"/>
+                <w:szCs w:val="17"/>
+              </w:rPr>
+              <w:t xml:space="preserve">1.0</w:t>
+            </w:r>
+          </w:p>
+        </w:tc>
+      </w:tr>
+      <w:tr>
+        <w:trPr>
+          <w:tblHeader w:val="false"/>
+        </w:trPr>
+        <w:tc>
+          <w:tcPr>
+            <w:tcW w:type="dxa" w:w="968"/>
+            <w:tcBorders>
+              <w:top w:val="single" w:color="808080" w:sz="4"/>
+              <w:left w:val="single" w:color="808080" w:sz="4"/>
+              <w:bottom w:val="single" w:color="808080" w:sz="4"/>
+              <w:right w:val="single" w:color="808080" w:sz="4"/>
+            </w:tcBorders>
+            <w:tcMar>
+              <w:top w:type="dxa" w:w="40"/>
+              <w:left w:type="dxa" w:w="80"/>
+              <w:bottom w:type="dxa" w:w="40"/>
+              <w:right w:type="dxa" w:w="80"/>
+            </w:tcMar>
+            <w:vAlign w:val="center"/>
+          </w:tcPr>
+          <w:p>
+            <w:pPr>
+              <w:spacing w:after="0" w:before="0" w:line="260"/>
+              <w:jc w:val="left"/>
+            </w:pPr>
+            <w:r>
+              <w:rPr>
+                <w:sz w:val="17"/>
+                <w:szCs w:val="17"/>
+              </w:rPr>
+              <w:t xml:space="preserve">산술·셀 2개+</w:t>
+            </w:r>
+          </w:p>
+        </w:tc>
+        <w:tc>
+          <w:tcPr>
+            <w:tcW w:type="dxa" w:w="825"/>
+            <w:tcBorders>
+              <w:top w:val="single" w:color="808080" w:sz="4"/>
+              <w:left w:val="single" w:color="808080" w:sz="4"/>
+              <w:bottom w:val="single" w:color="808080" w:sz="4"/>
+              <w:right w:val="single" w:color="808080" w:sz="4"/>
+            </w:tcBorders>
+            <w:tcMar>
+              <w:top w:type="dxa" w:w="40"/>
+              <w:left w:type="dxa" w:w="80"/>
+              <w:bottom w:type="dxa" w:w="40"/>
+              <w:right w:type="dxa" w:w="80"/>
+            </w:tcMar>
+            <w:vAlign w:val="center"/>
+          </w:tcPr>
+          <w:p>
+            <w:pPr>
+              <w:spacing w:after="0" w:before="0" w:line="260"/>
+              <w:jc w:val="right"/>
+            </w:pPr>
+            <w:r>
+              <w:rPr>
+                <w:sz w:val="17"/>
+                <w:szCs w:val="17"/>
+              </w:rPr>
+              <w:t xml:space="preserve">2,235</w:t>
+            </w:r>
+          </w:p>
+        </w:tc>
+        <w:tc>
+          <w:tcPr>
+            <w:tcW w:type="dxa" w:w="726"/>
+            <w:tcBorders>
+              <w:top w:val="single" w:color="808080" w:sz="4"/>
+              <w:left w:val="single" w:color="808080" w:sz="4"/>
+              <w:bottom w:val="single" w:color="808080" w:sz="4"/>
+              <w:right w:val="single" w:color="808080" w:sz="4"/>
+            </w:tcBorders>
+            <w:tcMar>
+              <w:top w:type="dxa" w:w="40"/>
+              <w:left w:type="dxa" w:w="80"/>
+              <w:bottom w:type="dxa" w:w="40"/>
+              <w:right w:type="dxa" w:w="80"/>
+            </w:tcMar>
+            <w:vAlign w:val="center"/>
+          </w:tcPr>
+          <w:p>
+            <w:pPr>
+              <w:spacing w:after="0" w:before="0" w:line="260"/>
+              <w:jc w:val="right"/>
+            </w:pPr>
+            <w:r>
+              <w:rPr>
+                <w:sz w:val="17"/>
+                <w:szCs w:val="17"/>
+              </w:rPr>
+              <w:t xml:space="preserve">.8492</w:t>
+            </w:r>
+          </w:p>
+        </w:tc>
+        <w:tc>
+          <w:tcPr>
+            <w:tcW w:type="dxa" w:w="1864"/>
+            <w:tcBorders>
+              <w:top w:val="single" w:color="808080" w:sz="4"/>
+              <w:left w:val="single" w:color="808080" w:sz="4"/>
+              <w:bottom w:val="single" w:color="808080" w:sz="4"/>
+              <w:right w:val="single" w:color="808080" w:sz="4"/>
+            </w:tcBorders>
+            <w:tcMar>
+              <w:top w:type="dxa" w:w="40"/>
+              <w:left w:type="dxa" w:w="80"/>
+              <w:bottom w:type="dxa" w:w="40"/>
+              <w:right w:type="dxa" w:w="80"/>
+            </w:tcMar>
+            <w:vAlign w:val="center"/>
+          </w:tcPr>
+          <w:p>
+            <w:pPr>
+              <w:spacing w:after="0" w:before="0" w:line="260"/>
+              <w:jc w:val="right"/>
+            </w:pPr>
+            <w:r>
+              <w:rPr>
+                <w:sz w:val="17"/>
+                <w:szCs w:val="17"/>
+              </w:rPr>
+              <w:t xml:space="preserve">.8273</w:t>
+            </w:r>
+          </w:p>
+        </w:tc>
+        <w:tc>
+          <w:tcPr>
+            <w:tcW w:type="dxa" w:w="2142"/>
+            <w:tcBorders>
+              <w:top w:val="single" w:color="808080" w:sz="4"/>
+              <w:left w:val="single" w:color="808080" w:sz="4"/>
+              <w:bottom w:val="single" w:color="808080" w:sz="4"/>
+              <w:right w:val="single" w:color="808080" w:sz="4"/>
+            </w:tcBorders>
+            <w:tcMar>
+              <w:top w:type="dxa" w:w="40"/>
+              <w:left w:type="dxa" w:w="80"/>
+              <w:bottom w:type="dxa" w:w="40"/>
+              <w:right w:type="dxa" w:w="80"/>
+            </w:tcMar>
+            <w:vAlign w:val="center"/>
+          </w:tcPr>
+          <w:p>
+            <w:pPr>
+              <w:spacing w:after="0" w:before="0" w:line="260"/>
+              <w:jc w:val="right"/>
+            </w:pPr>
+            <w:r>
+              <w:rPr>
+                <w:sz w:val="17"/>
+                <w:szCs w:val="17"/>
+              </w:rPr>
+              <w:t xml:space="preserve">111:62</w:t>
+            </w:r>
+          </w:p>
+        </w:tc>
+        <w:tc>
+          <w:tcPr>
+            <w:tcW w:type="dxa" w:w="845"/>
+            <w:tcBorders>
+              <w:top w:val="single" w:color="808080" w:sz="4"/>
+              <w:left w:val="single" w:color="808080" w:sz="4"/>
+              <w:bottom w:val="single" w:color="808080" w:sz="4"/>
+              <w:right w:val="single" w:color="808080" w:sz="4"/>
+            </w:tcBorders>
+            <w:tcMar>
+              <w:top w:type="dxa" w:w="40"/>
+              <w:left w:type="dxa" w:w="80"/>
+              <w:bottom w:type="dxa" w:w="40"/>
+              <w:right w:type="dxa" w:w="80"/>
+            </w:tcMar>
+            <w:vAlign w:val="center"/>
+          </w:tcPr>
+          <w:p>
+            <w:pPr>
+              <w:spacing w:after="0" w:before="0" w:line="260"/>
+              <w:jc w:val="right"/>
+            </w:pPr>
+            <w:r>
+              <w:rPr>
+                <w:sz w:val="17"/>
+                <w:szCs w:val="17"/>
+              </w:rPr>
+              <w:t xml:space="preserve">.00096</w:t>
+            </w:r>
+          </w:p>
+        </w:tc>
+      </w:tr>
+      <w:tr>
+        <w:trPr>
+          <w:tblHeader w:val="false"/>
+        </w:trPr>
+        <w:tc>
+          <w:tcPr>
+            <w:tcW w:type="dxa" w:w="968"/>
+            <w:tcBorders>
+              <w:top w:val="single" w:color="808080" w:sz="4"/>
+              <w:left w:val="single" w:color="808080" w:sz="4"/>
+              <w:bottom w:val="single" w:color="808080" w:sz="4"/>
+              <w:right w:val="single" w:color="808080" w:sz="4"/>
+            </w:tcBorders>
+            <w:tcMar>
+              <w:top w:type="dxa" w:w="40"/>
+              <w:left w:type="dxa" w:w="80"/>
+              <w:bottom w:type="dxa" w:w="40"/>
+              <w:right w:type="dxa" w:w="80"/>
+            </w:tcMar>
+            <w:vAlign w:val="center"/>
+          </w:tcPr>
+          <w:p>
+            <w:pPr>
+              <w:spacing w:after="0" w:before="0" w:line="260"/>
+              <w:jc w:val="left"/>
+            </w:pPr>
+            <w:r>
+              <w:rPr>
+                <w:sz w:val="17"/>
+                <w:szCs w:val="17"/>
+              </w:rPr>
+              <w:t xml:space="preserve">전체</w:t>
+            </w:r>
+          </w:p>
+        </w:tc>
+        <w:tc>
+          <w:tcPr>
+            <w:tcW w:type="dxa" w:w="825"/>
+            <w:tcBorders>
+              <w:top w:val="single" w:color="808080" w:sz="4"/>
+              <w:left w:val="single" w:color="808080" w:sz="4"/>
+              <w:bottom w:val="single" w:color="808080" w:sz="4"/>
+              <w:right w:val="single" w:color="808080" w:sz="4"/>
+            </w:tcBorders>
+            <w:tcMar>
+              <w:top w:type="dxa" w:w="40"/>
+              <w:left w:type="dxa" w:w="80"/>
+              <w:bottom w:type="dxa" w:w="40"/>
+              <w:right w:type="dxa" w:w="80"/>
+            </w:tcMar>
+            <w:vAlign w:val="center"/>
+          </w:tcPr>
+          <w:p>
+            <w:pPr>
+              <w:spacing w:after="0" w:before="0" w:line="260"/>
+              <w:jc w:val="right"/>
+            </w:pPr>
+            <w:r>
+              <w:rPr>
+                <w:sz w:val="17"/>
+                <w:szCs w:val="17"/>
+              </w:rPr>
+              <w:t xml:space="preserve">2,885</w:t>
+            </w:r>
+          </w:p>
+        </w:tc>
+        <w:tc>
+          <w:tcPr>
+            <w:tcW w:type="dxa" w:w="726"/>
+            <w:tcBorders>
+              <w:top w:val="single" w:color="808080" w:sz="4"/>
+              <w:left w:val="single" w:color="808080" w:sz="4"/>
+              <w:bottom w:val="single" w:color="808080" w:sz="4"/>
+              <w:right w:val="single" w:color="808080" w:sz="4"/>
+            </w:tcBorders>
+            <w:tcMar>
+              <w:top w:type="dxa" w:w="40"/>
+              <w:left w:type="dxa" w:w="80"/>
+              <w:bottom w:type="dxa" w:w="40"/>
+              <w:right w:type="dxa" w:w="80"/>
+            </w:tcMar>
+            <w:vAlign w:val="center"/>
+          </w:tcPr>
+          <w:p>
+            <w:pPr>
+              <w:spacing w:after="0" w:before="0" w:line="260"/>
+              <w:jc w:val="right"/>
+            </w:pPr>
+            <w:r>
+              <w:rPr>
+                <w:sz w:val="17"/>
+                <w:szCs w:val="17"/>
+              </w:rPr>
+              <w:t xml:space="preserve">.8634</w:t>
+            </w:r>
+          </w:p>
+        </w:tc>
+        <w:tc>
+          <w:tcPr>
+            <w:tcW w:type="dxa" w:w="1864"/>
+            <w:tcBorders>
+              <w:top w:val="single" w:color="808080" w:sz="4"/>
+              <w:left w:val="single" w:color="808080" w:sz="4"/>
+              <w:bottom w:val="single" w:color="808080" w:sz="4"/>
+              <w:right w:val="single" w:color="808080" w:sz="4"/>
+            </w:tcBorders>
+            <w:tcMar>
+              <w:top w:type="dxa" w:w="40"/>
+              <w:left w:type="dxa" w:w="80"/>
+              <w:bottom w:type="dxa" w:w="40"/>
+              <w:right w:type="dxa" w:w="80"/>
+            </w:tcMar>
+            <w:vAlign w:val="center"/>
+          </w:tcPr>
+          <w:p>
+            <w:pPr>
+              <w:spacing w:after="0" w:before="0" w:line="260"/>
+              <w:jc w:val="right"/>
+            </w:pPr>
+            <w:r>
+              <w:rPr>
+                <w:sz w:val="17"/>
+                <w:szCs w:val="17"/>
+              </w:rPr>
+              <w:t xml:space="preserve">.8458</w:t>
+            </w:r>
+          </w:p>
+        </w:tc>
+        <w:tc>
+          <w:tcPr>
+            <w:tcW w:type="dxa" w:w="2142"/>
+            <w:tcBorders>
+              <w:top w:val="single" w:color="808080" w:sz="4"/>
+              <w:left w:val="single" w:color="808080" w:sz="4"/>
+              <w:bottom w:val="single" w:color="808080" w:sz="4"/>
+              <w:right w:val="single" w:color="808080" w:sz="4"/>
+            </w:tcBorders>
+            <w:tcMar>
+              <w:top w:type="dxa" w:w="40"/>
+              <w:left w:type="dxa" w:w="80"/>
+              <w:bottom w:type="dxa" w:w="40"/>
+              <w:right w:type="dxa" w:w="80"/>
+            </w:tcMar>
+            <w:vAlign w:val="center"/>
+          </w:tcPr>
+          <w:p>
+            <w:pPr>
+              <w:spacing w:after="0" w:before="0" w:line="260"/>
+              <w:jc w:val="right"/>
+            </w:pPr>
+            <w:r>
+              <w:rPr>
+                <w:sz w:val="17"/>
+                <w:szCs w:val="17"/>
+              </w:rPr>
+              <w:t xml:space="preserve">133:82</w:t>
+            </w:r>
+          </w:p>
+        </w:tc>
+        <w:tc>
+          <w:tcPr>
+            <w:tcW w:type="dxa" w:w="845"/>
+            <w:tcBorders>
+              <w:top w:val="single" w:color="808080" w:sz="4"/>
+              <w:left w:val="single" w:color="808080" w:sz="4"/>
+              <w:bottom w:val="single" w:color="808080" w:sz="4"/>
+              <w:right w:val="single" w:color="808080" w:sz="4"/>
+            </w:tcBorders>
+            <w:tcMar>
+              <w:top w:type="dxa" w:w="40"/>
+              <w:left w:type="dxa" w:w="80"/>
+              <w:bottom w:type="dxa" w:w="40"/>
+              <w:right w:type="dxa" w:w="80"/>
+            </w:tcMar>
+            <w:vAlign w:val="center"/>
+          </w:tcPr>
+          <w:p>
+            <w:pPr>
+              <w:spacing w:after="0" w:before="0" w:line="260"/>
+              <w:jc w:val="right"/>
+            </w:pPr>
+            <w:r>
+              <w:rPr>
+                <w:sz w:val="17"/>
+                <w:szCs w:val="17"/>
+              </w:rPr>
+              <w:t xml:space="preserve">—</w:t>
+            </w:r>
+          </w:p>
+        </w:tc>
+      </w:tr>
+    </w:tbl>
+    <w:p>
+      <w:pPr>
+        <w:spacing w:after="120"/>
+      </w:pPr>
+    </w:p>
+    <w:p>
+      <w:pPr>
+        <w:ind w:firstLine="400"/>
+        <w:jc w:val="both"/>
+      </w:pPr>
+      <w:r>
+        <w:t xml:space="preserve">Holm p는 네 그룹을 한 묶음으로 보정한 값이다. 전체는 보정 묶음에 넣지 않았다.</w:t>
+      </w:r>
+    </w:p>
+    <w:p>
+      <w:pPr>
+        <w:ind w:firstLine="400"/>
+        <w:jc w:val="both"/>
+      </w:pPr>
+      <w:r>
+        <w:t xml:space="preserve">전체 검색 정확도는 본 방법 86.34%, table_description 84.58%였다(133:82, p=.00062). 차이는 산술·셀 2개 이상 그룹에서만 났다(111:62, Holm p=.00096). 값을 뺀 문장이 같은 문서의 다른 셀과 같은 셀의 비율은 table_description 7.0%, 본 방법 0%였다. 이 차이가 검색 정확도 차이의 원인인지는 검정하지 않았다.</w:t>
+      </w:r>
+    </w:p>
+    <w:p>
+      <w:pPr>
+        <w:pStyle w:val="Heading2"/>
+      </w:pPr>
+      <w:r>
+        <w:t xml:space="preserve">5.5 MultiHiertt 답변 정확도</w:t>
+      </w:r>
+    </w:p>
+    <w:p>
+      <w:pPr>
+        <w:ind w:firstLine="400"/>
+        <w:jc w:val="both"/>
+      </w:pPr>
+      <w:r>
+        <w:t xml:space="preserve">표 5-8은 네 그룹 882건에서 검색 결과를 그대로 리더(Qwen3-8B 4비트, 풀이 허용, 384토큰)에 넣었을 때의 답변 정확도다. 본 방법과 고정 청크는 둘 다 최종 머리글 규칙의 검색 결과를 쓴다. 표 전체와 TableRAG(Yu) 청크의 리더 입력은 머리글 규칙과 무관하다(4.2절). 가중 전체는 그룹별 정확도를 모집단 비율로 가중한 값이다(4.3절).</w:t>
       </w:r>
     </w:p>
     <w:p>
@@ -15570,7 +16804,7 @@
         <w:pStyle w:val="TableCaption"/>
       </w:pPr>
       <w:r>
-        <w:t xml:space="preserve">[표 5-7] MultiHiertt 답변 정확도 (문서 안, 예산 20, 882건; 셀 예산 비통제, 전달 셀 평균 열 참조)</w:t>
+        <w:t xml:space="preserve">[표 5-8] MultiHiertt 답변 정확도 (문서 안, 예산 20, 882건; 셀 예산 비통제, 전달 셀 평균 열 참조)</w:t>
       </w:r>
     </w:p>
     <w:tbl>
@@ -17305,7 +18539,7 @@
         <w:pStyle w:val="TableCaption"/>
       </w:pPr>
       <w:r>
-        <w:t xml:space="preserve">[표 5-8] 본 방법의 머리글 규칙별 답변 정확도 (MultiHiertt, 882건)</w:t>
+        <w:t xml:space="preserve">[표 5-9] 본 방법의 머리글 규칙별 답변 정확도 (MultiHiertt, 882건)</w:t>
       </w:r>
     </w:p>
     <w:tbl>
@@ -22264,7 +23498,7 @@
         <w:t xml:space="preserve">MultiHiertt 평가 분할과 사후 변경.</w:t>
       </w:r>
       <w:r>
-        <w:t xml:space="preserve"> MultiHiertt는 공개 test 파일에 정답과 정답 근거가 없어 train에서 평가 집합을 구성했다(4.1절). 리더 LLM의 사전학습 데이터에 공개 데이터셋이 포함되었는지는 확인할 수 없으며, 이 한계는 모든 분할에 동일하다. 다만 머리글 규칙(v3.3)은 train의 오류 사례를 보고 고쳤고, 문장 고유화는 882건 답변 결과를 분석하다 추가했다. 882건 답변 실험은 v1로 사전등록했고, 결과를 본 뒤 주 조건을 v3.3u로 바꾸었다(바꾸기 전에 예측과 함께 등록). 같은 882건을 v1, v3.3, v3.3u 세 조건에 썼으므로, v3.3u의 수치는 이 표본에 맞춰진 낙관적인 값일 수 있다. 이를 가늠할 수 있도록 v1과 v3.3 결과를 함께 실었다(표 5-6, 5-8). 882건과 겹치지 않는 문항으로 다시 확인하는 일은 하지 못했다. 또 비공식 재포장본을 썼고, 정답 값만 공식 릴리스에서 읽었다.</w:t>
+        <w:t xml:space="preserve"> MultiHiertt는 공개 test 파일에 정답과 정답 근거가 없어 train에서 평가 집합을 구성했다(4.1절). 리더 LLM의 사전학습 데이터에 공개 데이터셋이 포함되었는지는 확인할 수 없으며, 이 한계는 모든 분할에 동일하다. 다만 머리글 규칙(v3.3)은 train의 오류 사례를 보고 고쳤고, 문장 고유화는 882건 답변 결과를 분석하다 추가했다. 882건 답변 실험은 v1로 사전등록했고, 결과를 본 뒤 주 조건을 v3.3u로 바꾸었다(바꾸기 전에 예측과 함께 등록). 같은 882건을 v1, v3.3, v3.3u 세 조건에 썼으므로, v3.3u의 수치는 이 표본에 맞춰진 낙관적인 값일 수 있다. 이를 가늠할 수 있도록 v1과 v3.3 결과를 함께 실었다(표 5-6, 5-9). 882건과 겹치지 않는 문항으로 다시 확인하는 일은 하지 못했다. 또 비공식 재포장본을 썼고, 정답 값만 공식 릴리스에서 읽었다.</w:t>
       </w:r>
     </w:p>
     <w:p>

</xml_diff>

<commit_message>
HiTab 538표 한 색인 답변 결과: 본 방법 215 대 1,000자 청크 187(66:38, Holm p=.016), 표 단위 1위 표 212(42:39, Holm p=.82); 5.5·6.5 반영
- PREREG-2026-09-28-hitab538-answer.md 결과 절: 예측(본 방법 > 청크) 지지, 표 단위와 차이 없음
- 검색 성공 274/229/257, 입력 토큰 1,272/671/979, 표 안 조건 237 대비 −22 (6:28, 검정 없음)
- 점검: 1위 표가 정답 표인 257건 입력·출력이 표 전체 조건과 모두 같음
- 6.5 답변 실험의 검색 범위 문장, 수치 대조 불일치 0·출처 못 찾음 0, docx 빌드

Co-Authored-By: Claude Opus 5.5 <noreply@anthropic.com>
Claude-Session: https://claude.ai/code/session_017kQjg1EFwLnz8CjxGF6hf5
</commit_message>
<xml_diff>
--- a/rag-agent/thesis/thesis.docx
+++ b/rag-agent/thesis/thesis.docx
@@ -18691,6 +18691,22 @@
           <w:b/>
           <w:bCs/>
         </w:rPr>
+        <w:t xml:space="preserve">538표 한 색인 조건.</w:t>
+      </w:r>
+      <w:r>
+        <w:t xml:space="preserve"> 538표를 한 색인에 넣어 표 전체를 입력할 수 없는 조건에서 본 방법은 215/300, 1,000자 고정 청크는 187/300이었다(66:38, p=.0078, Holm p=.016). 표 단위 색인의 검색 1위 표 하나를 표 전체 조건과 같은 마크다운으로 넣은 조건은 212/300으로 본 방법과 차이가 없었다(42:39, p=.82, Holm p=.82). 이 조건에는 표 전체를 입력하는 대조군을 둘 수 없으므로 검색 방법끼리만 비교했고, Holm 보정은 이 두 비교를 한 묶음으로 했다(PREREG-2026-09-28-hitab538-answer.md, 실행 전 등록). 검색 성공은 본 방법 274건, 고정 청크 229건, 표 단위 1위 표 257건이었고, 리더 입력 토큰 평균은 각각 1,272, 671, 979였다. 본 방법의 정답 수는 질문의 표 안에서 검색한 조건(237)보다 22건 적었다(538표 조건만 맞힘 6 : 표 안 조건만 맞힘 28, 검정하지 않음). 질문의 표를 모르는 조건에서도 본 방법은 고정 청크보다 답변 정확도가 높았지만, 1위 표 전체를 넣는 방법보다 높지는 않았다.</w:t>
+      </w:r>
+    </w:p>
+    <w:p>
+      <w:pPr>
+        <w:ind w:firstLine="400"/>
+        <w:jc w:val="both"/>
+      </w:pPr>
+      <w:r>
+        <w:rPr>
+          <w:b/>
+          <w:bCs/>
+        </w:rPr>
         <w:t xml:space="preserve">나머지 비교군.</w:t>
       </w:r>
       <w:r>
@@ -23644,6 +23660,22 @@
       </w:r>
       <w:r>
         <w:t xml:space="preserve"> HiTab은 Qwen2.5-7B-Instruct(답만 출력), MultiHiertt는 Qwen3-8B(풀이 허용)를 쓴다. 두 데이터셋의 답변 정확도는 서로 비교할 수 없다. 모든 리더는 4비트로 양자화했다.</w:t>
+      </w:r>
+    </w:p>
+    <w:p>
+      <w:pPr>
+        <w:ind w:firstLine="400"/>
+        <w:jc w:val="both"/>
+      </w:pPr>
+      <w:r>
+        <w:rPr>
+          <w:b/>
+          <w:bCs/>
+        </w:rPr>
+        <w:t xml:space="preserve">답변 실험의 검색 범위.</w:t>
+      </w:r>
+      <w:r>
+        <w:t xml:space="preserve"> HiTab 답변 실험은 질문의 표 하나 안에서 검색한 조건과 538표를 한 색인에 넣은 조건에서 했고, MultiHiertt 답변 실험은 질문의 문서에 있는 표들을 한 색인에 넣고 검색했다.</w:t>
       </w:r>
     </w:p>
     <w:p>

</xml_diff>